<commit_message>
About: profile for Aayushi with an expandable full profile; Word profile refreshed (not yet published)
Co-Authored-By: Claude Opus 5.5 <noreply@anthropic.com>
Claude-Session: https://claude.ai/code/session_01RSCU9Tog2TmXVif83jTYoy
</commit_message>
<xml_diff>
--- a/content/S3-Impact-Foundation-Profile.docx
+++ b/content/S3-Impact-Foundation-Profile.docx
@@ -2119,22 +2119,7 @@
           <w:sz w:val="18"/>
           <w:szCs w:val="18"/>
         </w:rPr>
-        <w:t xml:space="preserve">Aayushi serves on the foundation’s board of trustees and helps shape its creative direction.</w:t>
-      </w:r>
-      <w:r>
-        <w:t xml:space="preserve"> </w:t>
-      </w:r>
-      <w:r>
-        <w:rPr>
-          <w:rFonts w:ascii="Calibri" w:cs="Calibri" w:eastAsia="Calibri" w:hAnsi="Calibri"/>
-          <w:i/>
-          <w:iCs/>
-          <w:color w:val="13162C"/>
-          <w:sz w:val="18"/>
-          <w:szCs w:val="18"/>
-          <w:highlight w:val="yellow"/>
-        </w:rPr>
-        <w:t xml:space="preserve">A fuller background to be added</w:t>
+        <w:t xml:space="preserve">Aayushi serves on the foundation’s board of trustees and helps shape its creative direction. A strategic designer trained at Central Saint Martins, she brings years of work with Govardhan Ecovillage and a practice centred on people, communities and the stories that move others to act.</w:t>
       </w:r>
     </w:p>
     <w:p>

</xml_diff>

<commit_message>
Add website address and email; Word profile refreshed (not yet published)
Co-Authored-By: Claude Opus 5.5 <noreply@anthropic.com>
Claude-Session: https://claude.ai/code/session_01RSCU9Tog2TmXVif83jTYoy
</commit_message>
<xml_diff>
--- a/content/S3-Impact-Foundation-Profile.docx
+++ b/content/S3-Impact-Foundation-Profile.docx
@@ -2299,6 +2299,38 @@
             <w:r>
               <w:rPr>
                 <w:rFonts w:ascii="Calibri" w:cs="Calibri" w:eastAsia="Calibri" w:hAnsi="Calibri"/>
+                <w:color w:val="FFFFFF"/>
+                <w:sz w:val="18"/>
+                <w:szCs w:val="18"/>
+              </w:rPr>
+              <w:t xml:space="preserve">contact@s3impact.org.in</w:t>
+            </w:r>
+          </w:p>
+          <w:p>
+            <w:pPr>
+              <w:tabs>
+                <w:tab w:val="left" w:pos="1100"/>
+              </w:tabs>
+              <w:spacing w:after="50"/>
+            </w:pPr>
+            <w:r>
+              <w:rPr>
+                <w:rFonts w:ascii="Calibri" w:cs="Calibri" w:eastAsia="Calibri" w:hAnsi="Calibri"/>
+                <w:b/>
+                <w:bCs/>
+                <w:color w:val="9DCFE0"/>
+                <w:spacing w:val="30"/>
+                <w:sz w:val="14"/>
+                <w:szCs w:val="14"/>
+              </w:rPr>
+              <w:t xml:space="preserve">PHONE</w:t>
+            </w:r>
+            <w:r>
+              <w:t xml:space="preserve">	</w:t>
+            </w:r>
+            <w:r>
+              <w:rPr>
+                <w:rFonts w:ascii="Calibri" w:cs="Calibri" w:eastAsia="Calibri" w:hAnsi="Calibri"/>
                 <w:i/>
                 <w:iCs/>
                 <w:color w:val="13162C"/>
@@ -2306,7 +2338,7 @@
                 <w:szCs w:val="18"/>
                 <w:highlight w:val="yellow"/>
               </w:rPr>
-              <w:t xml:space="preserve">Email to be added</w:t>
+              <w:t xml:space="preserve">Phone to be added</w:t>
             </w:r>
           </w:p>
           <w:p>
@@ -2326,7 +2358,7 @@
                 <w:sz w:val="14"/>
                 <w:szCs w:val="14"/>
               </w:rPr>
-              <w:t xml:space="preserve">PHONE</w:t>
+              <w:t xml:space="preserve">WEBSITE</w:t>
             </w:r>
             <w:r>
               <w:t xml:space="preserve">	</w:t>
@@ -2334,49 +2366,11 @@
             <w:r>
               <w:rPr>
                 <w:rFonts w:ascii="Calibri" w:cs="Calibri" w:eastAsia="Calibri" w:hAnsi="Calibri"/>
-                <w:i/>
-                <w:iCs/>
-                <w:color w:val="13162C"/>
+                <w:color w:val="FFFFFF"/>
                 <w:sz w:val="18"/>
                 <w:szCs w:val="18"/>
-                <w:highlight w:val="yellow"/>
-              </w:rPr>
-              <w:t xml:space="preserve">Phone to be added</w:t>
-            </w:r>
-          </w:p>
-          <w:p>
-            <w:pPr>
-              <w:tabs>
-                <w:tab w:val="left" w:pos="1100"/>
-              </w:tabs>
-              <w:spacing w:after="50"/>
-            </w:pPr>
-            <w:r>
-              <w:rPr>
-                <w:rFonts w:ascii="Calibri" w:cs="Calibri" w:eastAsia="Calibri" w:hAnsi="Calibri"/>
-                <w:b/>
-                <w:bCs/>
-                <w:color w:val="9DCFE0"/>
-                <w:spacing w:val="30"/>
-                <w:sz w:val="14"/>
-                <w:szCs w:val="14"/>
-              </w:rPr>
-              <w:t xml:space="preserve">WEBSITE</w:t>
-            </w:r>
-            <w:r>
-              <w:t xml:space="preserve">	</w:t>
-            </w:r>
-            <w:r>
-              <w:rPr>
-                <w:rFonts w:ascii="Calibri" w:cs="Calibri" w:eastAsia="Calibri" w:hAnsi="Calibri"/>
-                <w:i/>
-                <w:iCs/>
-                <w:color w:val="13162C"/>
-                <w:sz w:val="18"/>
-                <w:szCs w:val="18"/>
-                <w:highlight w:val="yellow"/>
-              </w:rPr>
-              <w:t xml:space="preserve">Web address to be added</w:t>
+              </w:rPr>
+              <w:t xml:space="preserve">s3impact.org.in</w:t>
             </w:r>
           </w:p>
         </w:tc>

</xml_diff>

<commit_message>
Calmer colours in the Word profile; 'Looking ahead' replaces 'waiting for partners' across the site and profile (not yet published)
Co-Authored-By: Claude Opus 5.5 <noreply@anthropic.com>
Claude-Session: https://claude.ai/code/session_01RSCU9Tog2TmXVif83jTYoy
</commit_message>
<xml_diff>
--- a/content/S3-Impact-Foundation-Profile.docx
+++ b/content/S3-Impact-Foundation-Profile.docx
@@ -473,7 +473,7 @@
           <w:rFonts w:ascii="Calibri" w:cs="Calibri" w:eastAsia="Calibri" w:hAnsi="Calibri"/>
           <w:b/>
           <w:bCs/>
-          <w:color w:val="2F6B36"/>
+          <w:color w:val="2F7FA0"/>
           <w:spacing w:val="40"/>
           <w:sz w:val="15"/>
           <w:szCs w:val="15"/>
@@ -541,7 +541,7 @@
             <w:r>
               <w:rPr>
                 <w:rFonts w:ascii="Georgia" w:cs="Georgia" w:eastAsia="Georgia" w:hAnsi="Georgia"/>
-                <w:color w:val="B23F20"/>
+                <w:color w:val="13162C"/>
                 <w:sz w:val="21"/>
                 <w:szCs w:val="21"/>
               </w:rPr>
@@ -587,7 +587,7 @@
             <w:r>
               <w:rPr>
                 <w:rFonts w:ascii="Georgia" w:cs="Georgia" w:eastAsia="Georgia" w:hAnsi="Georgia"/>
-                <w:color w:val="2F6B36"/>
+                <w:color w:val="13162C"/>
                 <w:sz w:val="21"/>
                 <w:szCs w:val="21"/>
               </w:rPr>
@@ -633,7 +633,7 @@
             <w:r>
               <w:rPr>
                 <w:rFonts w:ascii="Georgia" w:cs="Georgia" w:eastAsia="Georgia" w:hAnsi="Georgia"/>
-                <w:color w:val="A86B00"/>
+                <w:color w:val="13162C"/>
                 <w:sz w:val="21"/>
                 <w:szCs w:val="21"/>
               </w:rPr>
@@ -684,7 +684,7 @@
             <w:r>
               <w:rPr>
                 <w:rFonts w:ascii="Georgia" w:cs="Georgia" w:eastAsia="Georgia" w:hAnsi="Georgia"/>
-                <w:color w:val="1F6A8A"/>
+                <w:color w:val="13162C"/>
                 <w:sz w:val="21"/>
                 <w:szCs w:val="21"/>
               </w:rPr>
@@ -730,7 +730,7 @@
             <w:r>
               <w:rPr>
                 <w:rFonts w:ascii="Georgia" w:cs="Georgia" w:eastAsia="Georgia" w:hAnsi="Georgia"/>
-                <w:color w:val="A3315F"/>
+                <w:color w:val="13162C"/>
                 <w:sz w:val="21"/>
                 <w:szCs w:val="21"/>
               </w:rPr>
@@ -776,7 +776,7 @@
             <w:r>
               <w:rPr>
                 <w:rFonts w:ascii="Georgia" w:cs="Georgia" w:eastAsia="Georgia" w:hAnsi="Georgia"/>
-                <w:color w:val="1F6A8A"/>
+                <w:color w:val="13162C"/>
                 <w:sz w:val="21"/>
                 <w:szCs w:val="21"/>
               </w:rPr>
@@ -810,7 +810,7 @@
           <w:rFonts w:ascii="Calibri" w:cs="Calibri" w:eastAsia="Calibri" w:hAnsi="Calibri"/>
           <w:b/>
           <w:bCs/>
-          <w:color w:val="B23F20"/>
+          <w:color w:val="2F7FA0"/>
           <w:spacing w:val="40"/>
           <w:sz w:val="15"/>
           <w:szCs w:val="15"/>
@@ -827,7 +827,7 @@
           <w:rFonts w:ascii="Calibri" w:cs="Calibri" w:eastAsia="Calibri" w:hAnsi="Calibri"/>
           <w:b/>
           <w:bCs/>
-          <w:color w:val="B23F20"/>
+          <w:color w:val="13162C"/>
           <w:sz w:val="19"/>
           <w:szCs w:val="19"/>
         </w:rPr>
@@ -852,7 +852,7 @@
           <w:rFonts w:ascii="Calibri" w:cs="Calibri" w:eastAsia="Calibri" w:hAnsi="Calibri"/>
           <w:b/>
           <w:bCs/>
-          <w:color w:val="2F6B36"/>
+          <w:color w:val="13162C"/>
           <w:sz w:val="19"/>
           <w:szCs w:val="19"/>
         </w:rPr>
@@ -877,7 +877,7 @@
           <w:rFonts w:ascii="Calibri" w:cs="Calibri" w:eastAsia="Calibri" w:hAnsi="Calibri"/>
           <w:b/>
           <w:bCs/>
-          <w:color w:val="A86B00"/>
+          <w:color w:val="13162C"/>
           <w:sz w:val="19"/>
           <w:szCs w:val="19"/>
         </w:rPr>
@@ -903,7 +903,7 @@
           <w:rFonts w:ascii="Calibri" w:cs="Calibri" w:eastAsia="Calibri" w:hAnsi="Calibri"/>
           <w:b/>
           <w:bCs/>
-          <w:color w:val="A86B00"/>
+          <w:color w:val="2F7FA0"/>
           <w:spacing w:val="40"/>
           <w:sz w:val="15"/>
           <w:szCs w:val="15"/>
@@ -920,7 +920,7 @@
           <w:rFonts w:ascii="Calibri" w:cs="Calibri" w:eastAsia="Calibri" w:hAnsi="Calibri"/>
           <w:b/>
           <w:bCs/>
-          <w:color w:val="B23F20"/>
+          <w:color w:val="13162C"/>
           <w:sz w:val="19"/>
           <w:szCs w:val="19"/>
         </w:rPr>
@@ -945,7 +945,7 @@
           <w:rFonts w:ascii="Calibri" w:cs="Calibri" w:eastAsia="Calibri" w:hAnsi="Calibri"/>
           <w:b/>
           <w:bCs/>
-          <w:color w:val="A3315F"/>
+          <w:color w:val="13162C"/>
           <w:sz w:val="19"/>
           <w:szCs w:val="19"/>
         </w:rPr>
@@ -970,7 +970,7 @@
           <w:rFonts w:ascii="Calibri" w:cs="Calibri" w:eastAsia="Calibri" w:hAnsi="Calibri"/>
           <w:b/>
           <w:bCs/>
-          <w:color w:val="2F6B36"/>
+          <w:color w:val="13162C"/>
           <w:sz w:val="19"/>
           <w:szCs w:val="19"/>
         </w:rPr>
@@ -995,7 +995,7 @@
           <w:rFonts w:ascii="Calibri" w:cs="Calibri" w:eastAsia="Calibri" w:hAnsi="Calibri"/>
           <w:b/>
           <w:bCs/>
-          <w:color w:val="1F6A8A"/>
+          <w:color w:val="13162C"/>
           <w:sz w:val="19"/>
           <w:szCs w:val="19"/>
         </w:rPr>
@@ -1020,7 +1020,7 @@
           <w:rFonts w:ascii="Calibri" w:cs="Calibri" w:eastAsia="Calibri" w:hAnsi="Calibri"/>
           <w:b/>
           <w:bCs/>
-          <w:color w:val="A86B00"/>
+          <w:color w:val="13162C"/>
           <w:sz w:val="19"/>
           <w:szCs w:val="19"/>
         </w:rPr>
@@ -1047,7 +1047,7 @@
           <w:rFonts w:ascii="Calibri" w:cs="Calibri" w:eastAsia="Calibri" w:hAnsi="Calibri"/>
           <w:b/>
           <w:bCs/>
-          <w:color w:val="B23F20"/>
+          <w:color w:val="2F7FA0"/>
           <w:spacing w:val="40"/>
           <w:sz w:val="15"/>
           <w:szCs w:val="15"/>
@@ -1103,7 +1103,7 @@
             <w:r>
               <w:rPr>
                 <w:rFonts w:ascii="Georgia" w:cs="Georgia" w:eastAsia="Georgia" w:hAnsi="Georgia"/>
-                <w:color w:val="B23F20"/>
+                <w:color w:val="2F7FA0"/>
                 <w:sz w:val="34"/>
                 <w:szCs w:val="34"/>
               </w:rPr>
@@ -1197,7 +1197,7 @@
             <w:r>
               <w:rPr>
                 <w:rFonts w:ascii="Georgia" w:cs="Georgia" w:eastAsia="Georgia" w:hAnsi="Georgia"/>
-                <w:color w:val="2F6B36"/>
+                <w:color w:val="2F7FA0"/>
                 <w:sz w:val="34"/>
                 <w:szCs w:val="34"/>
               </w:rPr>
@@ -1244,7 +1244,7 @@
             <w:r>
               <w:rPr>
                 <w:rFonts w:ascii="Georgia" w:cs="Georgia" w:eastAsia="Georgia" w:hAnsi="Georgia"/>
-                <w:color w:val="A86B00"/>
+                <w:color w:val="2F7FA0"/>
                 <w:sz w:val="34"/>
                 <w:szCs w:val="34"/>
               </w:rPr>
@@ -1296,7 +1296,7 @@
             <w:r>
               <w:rPr>
                 <w:rFonts w:ascii="Georgia" w:cs="Georgia" w:eastAsia="Georgia" w:hAnsi="Georgia"/>
-                <w:color w:val="2F6B36"/>
+                <w:color w:val="2F7FA0"/>
                 <w:sz w:val="34"/>
                 <w:szCs w:val="34"/>
               </w:rPr>
@@ -1390,7 +1390,7 @@
             <w:r>
               <w:rPr>
                 <w:rFonts w:ascii="Georgia" w:cs="Georgia" w:eastAsia="Georgia" w:hAnsi="Georgia"/>
-                <w:color w:val="A86B00"/>
+                <w:color w:val="2F7FA0"/>
                 <w:sz w:val="34"/>
                 <w:szCs w:val="34"/>
               </w:rPr>
@@ -1437,7 +1437,7 @@
             <w:r>
               <w:rPr>
                 <w:rFonts w:ascii="Georgia" w:cs="Georgia" w:eastAsia="Georgia" w:hAnsi="Georgia"/>
-                <w:color w:val="B23F20"/>
+                <w:color w:val="2F7FA0"/>
                 <w:sz w:val="34"/>
                 <w:szCs w:val="34"/>
               </w:rPr>
@@ -1928,7 +1928,7 @@
           <w:rFonts w:ascii="Calibri" w:cs="Calibri" w:eastAsia="Calibri" w:hAnsi="Calibri"/>
           <w:b/>
           <w:bCs/>
-          <w:color w:val="A86B00"/>
+          <w:color w:val="2F7FA0"/>
           <w:spacing w:val="40"/>
           <w:sz w:val="15"/>
           <w:szCs w:val="15"/>
@@ -1945,7 +1945,7 @@
           <w:rFonts w:ascii="Calibri" w:cs="Calibri" w:eastAsia="Calibri" w:hAnsi="Calibri"/>
           <w:b/>
           <w:bCs/>
-          <w:color w:val="1F6A8A"/>
+          <w:color w:val="13162C"/>
           <w:sz w:val="18"/>
           <w:szCs w:val="18"/>
         </w:rPr>
@@ -1970,7 +1970,7 @@
           <w:rFonts w:ascii="Calibri" w:cs="Calibri" w:eastAsia="Calibri" w:hAnsi="Calibri"/>
           <w:b/>
           <w:bCs/>
-          <w:color w:val="A86B00"/>
+          <w:color w:val="13162C"/>
           <w:sz w:val="18"/>
           <w:szCs w:val="18"/>
         </w:rPr>
@@ -1995,7 +1995,7 @@
           <w:rFonts w:ascii="Calibri" w:cs="Calibri" w:eastAsia="Calibri" w:hAnsi="Calibri"/>
           <w:b/>
           <w:bCs/>
-          <w:color w:val="2F6B36"/>
+          <w:color w:val="13162C"/>
           <w:sz w:val="18"/>
           <w:szCs w:val="18"/>
         </w:rPr>
@@ -2132,12 +2132,12 @@
           <w:rFonts w:ascii="Calibri" w:cs="Calibri" w:eastAsia="Calibri" w:hAnsi="Calibri"/>
           <w:b/>
           <w:bCs/>
-          <w:color w:val="2F6B36"/>
+          <w:color w:val="2F7FA0"/>
           <w:spacing w:val="40"/>
           <w:sz w:val="15"/>
           <w:szCs w:val="15"/>
         </w:rPr>
-        <w:t xml:space="preserve">PROJECTS WAITING FOR PARTNERS</w:t>
+        <w:t xml:space="preserve">LOOKING AHEAD</w:t>
       </w:r>
     </w:p>
     <w:p>
@@ -2151,7 +2151,7 @@
           <w:sz w:val="18"/>
           <w:szCs w:val="18"/>
         </w:rPr>
-        <w:t xml:space="preserve">Seven projects are waiting for partners. Each one grows from work already under way.</w:t>
+        <w:t xml:space="preserve">Seven new projects are taking shape, each one growing from work already under way.</w:t>
       </w:r>
     </w:p>
     <w:p>

</xml_diff>

<commit_message>
Word profile: dark blue header and footer bands with the full logo; contact details in the footer (not yet published)
Co-Authored-By: Claude Opus 5.5 <noreply@anthropic.com>
Claude-Session: https://claude.ai/code/session_01RSCU9Tog2TmXVif83jTYoy
</commit_message>
<xml_diff>
--- a/content/S3-Impact-Foundation-Profile.docx
+++ b/content/S3-Impact-Foundation-Profile.docx
@@ -2,145 +2,6 @@
 <file path=word/document.xml><?xml version="1.0" encoding="utf-8"?>
 <w:document xmlns:wpc="http://schemas.microsoft.com/office/word/2010/wordprocessingCanvas" xmlns:mc="http://schemas.openxmlformats.org/markup-compatibility/2006" xmlns:o="urn:schemas-microsoft-com:office:office" xmlns:r="http://schemas.openxmlformats.org/officeDocument/2006/relationships" xmlns:m="http://schemas.openxmlformats.org/officeDocument/2006/math" xmlns:v="urn:schemas-microsoft-com:vml" xmlns:wp14="http://schemas.microsoft.com/office/word/2010/wordprocessingDrawing" xmlns:wp="http://schemas.openxmlformats.org/drawingml/2006/wordprocessingDrawing" xmlns:w10="urn:schemas-microsoft-com:office:word" xmlns:w="http://schemas.openxmlformats.org/wordprocessingml/2006/main" xmlns:w14="http://schemas.microsoft.com/office/word/2010/wordml" xmlns:w15="http://schemas.microsoft.com/office/word/2012/wordml" xmlns:wpg="http://schemas.microsoft.com/office/word/2010/wordprocessingGroup" xmlns:wpi="http://schemas.microsoft.com/office/word/2010/wordprocessingInk" xmlns:wne="http://schemas.microsoft.com/office/word/2006/wordml" xmlns:wps="http://schemas.microsoft.com/office/word/2010/wordprocessingShape" xmlns:cx="http://schemas.microsoft.com/office/drawing/2014/chartex" xmlns:cx1="http://schemas.microsoft.com/office/drawing/2015/9/8/chartex" xmlns:cx2="http://schemas.microsoft.com/office/drawing/2015/10/21/chartex" xmlns:cx3="http://schemas.microsoft.com/office/drawing/2016/5/9/chartex" xmlns:cx4="http://schemas.microsoft.com/office/drawing/2016/5/10/chartex" xmlns:cx5="http://schemas.microsoft.com/office/drawing/2016/5/11/chartex" xmlns:cx6="http://schemas.microsoft.com/office/drawing/2016/5/12/chartex" xmlns:cx7="http://schemas.microsoft.com/office/drawing/2016/5/13/chartex" xmlns:cx8="http://schemas.microsoft.com/office/drawing/2016/5/14/chartex" xmlns:aink="http://schemas.microsoft.com/office/drawing/2016/ink" xmlns:am3d="http://schemas.microsoft.com/office/drawing/2017/model3d" xmlns:w16cex="http://schemas.microsoft.com/office/word/2018/wordml/cex" xmlns:w16cid="http://schemas.microsoft.com/office/word/2016/wordml/cid" xmlns:w16="http://schemas.microsoft.com/office/word/2018/wordml" xmlns:w16sdtdh="http://schemas.microsoft.com/office/word/2020/wordml/sdtdatahash" xmlns:w16se="http://schemas.microsoft.com/office/word/2015/wordml/symex" mc:Ignorable="w14 w15 wp14">
   <w:body>
-    <w:tbl>
-      <w:tblPr>
-        <w:tblW w:type="dxa" w:w="9638"/>
-        <w:tblBorders>
-          <w:top w:val="none" w:color="FFFFFF" w:sz="0"/>
-          <w:left w:val="none" w:color="FFFFFF" w:sz="0"/>
-          <w:bottom w:val="none" w:color="FFFFFF" w:sz="0"/>
-          <w:right w:val="none" w:color="FFFFFF" w:sz="0"/>
-          <w:insideH w:val="none" w:color="FFFFFF" w:sz="0"/>
-          <w:insideV w:val="none" w:color="FFFFFF" w:sz="0"/>
-        </w:tblBorders>
-        <w:tblLayout w:type="fixed"/>
-      </w:tblPr>
-      <w:tblGrid>
-        <w:gridCol w:w="4000"/>
-        <w:gridCol w:w="5638"/>
-      </w:tblGrid>
-      <w:tr>
-        <w:tc>
-          <w:tcPr>
-            <w:tcW w:type="dxa" w:w="4000"/>
-            <w:tcBorders>
-              <w:top w:val="none" w:color="FFFFFF" w:sz="0"/>
-              <w:left w:val="none" w:color="FFFFFF" w:sz="0"/>
-              <w:bottom w:val="none" w:color="FFFFFF" w:sz="0"/>
-              <w:right w:val="none" w:color="FFFFFF" w:sz="0"/>
-            </w:tcBorders>
-            <w:tcMar>
-              <w:top w:type="dxa" w:w="120"/>
-              <w:left w:type="dxa" w:w="0"/>
-              <w:bottom w:type="dxa" w:w="120"/>
-              <w:right w:type="dxa" w:w="0"/>
-            </w:tcMar>
-            <w:vAlign w:val="center"/>
-          </w:tcPr>
-          <w:p>
-            <w:pPr>
-              <w:spacing w:after="0" w:before="0"/>
-            </w:pPr>
-            <w:r>
-              <w:drawing>
-                <wp:inline distT="0" distB="0" distL="0" distR="0">
-                  <wp:extent cx="1619250" cy="628650"/>
-                  <wp:effectExtent t="0" r="0" b="0" l="0"/>
-                  <wp:docPr id="1" name=""/>
-                  <wp:cNvGraphicFramePr>
-                    <a:graphicFrameLocks xmlns:a="http://schemas.openxmlformats.org/drawingml/2006/main" noChangeAspect="1"/>
-                  </wp:cNvGraphicFramePr>
-                  <a:graphic xmlns:a="http://schemas.openxmlformats.org/drawingml/2006/main">
-                    <a:graphicData uri="http://schemas.openxmlformats.org/drawingml/2006/picture">
-                      <pic:pic xmlns:pic="http://schemas.openxmlformats.org/drawingml/2006/picture">
-                        <pic:nvPicPr>
-                          <pic:cNvPr id="0" name="" descr=""/>
-                          <pic:cNvPicPr>
-                            <a:picLocks noChangeAspect="1" noChangeArrowheads="1"/>
-                          </pic:cNvPicPr>
-                        </pic:nvPicPr>
-                        <pic:blipFill>
-                          <a:blip r:embed="rId8" cstate="none"/>
-                          <a:srcRect/>
-                          <a:stretch>
-                            <a:fillRect/>
-                          </a:stretch>
-                        </pic:blipFill>
-                        <pic:spPr bwMode="auto">
-                          <a:xfrm>
-                            <a:off x="0" y="0"/>
-                            <a:ext cx="1619250" cy="628650"/>
-                          </a:xfrm>
-                          <a:prstGeom prst="rect">
-                            <a:avLst/>
-                          </a:prstGeom>
-                        </pic:spPr>
-                      </pic:pic>
-                    </a:graphicData>
-                  </a:graphic>
-                </wp:inline>
-              </w:drawing>
-            </w:r>
-          </w:p>
-        </w:tc>
-        <w:tc>
-          <w:tcPr>
-            <w:tcW w:type="dxa" w:w="5638"/>
-            <w:tcBorders>
-              <w:top w:val="none" w:color="FFFFFF" w:sz="0"/>
-              <w:left w:val="none" w:color="FFFFFF" w:sz="0"/>
-              <w:bottom w:val="none" w:color="FFFFFF" w:sz="0"/>
-              <w:right w:val="none" w:color="FFFFFF" w:sz="0"/>
-            </w:tcBorders>
-            <w:tcMar>
-              <w:top w:type="dxa" w:w="120"/>
-              <w:left w:type="dxa" w:w="0"/>
-              <w:bottom w:type="dxa" w:w="120"/>
-              <w:right w:type="dxa" w:w="0"/>
-            </w:tcMar>
-            <w:vAlign w:val="center"/>
-          </w:tcPr>
-          <w:p>
-            <w:pPr>
-              <w:spacing w:after="20" w:before="0" w:line="276"/>
-              <w:jc w:val="right"/>
-            </w:pPr>
-            <w:r>
-              <w:rPr>
-                <w:rFonts w:ascii="Calibri" w:cs="Calibri" w:eastAsia="Calibri" w:hAnsi="Calibri"/>
-                <w:b/>
-                <w:bCs/>
-                <w:color w:val="2F7FA0"/>
-                <w:spacing w:val="50"/>
-                <w:sz w:val="15"/>
-                <w:szCs w:val="15"/>
-              </w:rPr>
-              <w:t xml:space="preserve">ORGANISATION PROFILE</w:t>
-            </w:r>
-          </w:p>
-          <w:p>
-            <w:pPr>
-              <w:spacing w:after="0" w:before="0" w:line="276"/>
-              <w:jc w:val="right"/>
-            </w:pPr>
-            <w:r>
-              <w:rPr>
-                <w:rFonts w:ascii="Calibri" w:cs="Calibri" w:eastAsia="Calibri" w:hAnsi="Calibri"/>
-                <w:color w:val="5A5F7E"/>
-                <w:sz w:val="16"/>
-                <w:szCs w:val="16"/>
-              </w:rPr>
-              <w:t xml:space="preserve">October 2026</w:t>
-            </w:r>
-          </w:p>
-        </w:tc>
-      </w:tr>
-    </w:tbl>
-    <w:p>
-      <w:pPr>
-        <w:spacing w:after="160" w:before="0" w:line="276"/>
-      </w:pPr>
-    </w:p>
     <w:tbl>
       <w:tblPr>
         <w:tblW w:type="dxa" w:w="9638"/>
@@ -2168,218 +2029,51 @@
         <w:t xml:space="preserve">Surya Kund Water Conservation Project  ·  Braj kunds: Jal Vihar, Kamal and Vihval Kund  ·  AgriVoltaics Pilot  ·  Palghar Dog Welfare Sanctuary  ·  Vedic Value Education Programme  ·  Govardhan English Medium School  ·  GEV Madhya</w:t>
       </w:r>
     </w:p>
-    <w:tbl>
-      <w:tblPr>
-        <w:tblW w:type="dxa" w:w="9638"/>
-        <w:tblBorders>
-          <w:top w:val="none" w:color="FFFFFF" w:sz="0"/>
-          <w:left w:val="none" w:color="FFFFFF" w:sz="0"/>
-          <w:bottom w:val="none" w:color="FFFFFF" w:sz="0"/>
-          <w:right w:val="none" w:color="FFFFFF" w:sz="0"/>
-          <w:insideH w:val="none" w:color="FFFFFF" w:sz="0"/>
-          <w:insideV w:val="none" w:color="FFFFFF" w:sz="0"/>
-        </w:tblBorders>
-        <w:tblLayout w:type="fixed"/>
-      </w:tblPr>
-      <w:tblGrid>
-        <w:gridCol w:w="9638"/>
-      </w:tblGrid>
-      <w:tr>
-        <w:tc>
-          <w:tcPr>
-            <w:tcW w:type="dxa" w:w="9638"/>
-            <w:tcBorders>
-              <w:top w:val="none" w:color="FFFFFF" w:sz="0"/>
-              <w:left w:val="none" w:color="FFFFFF" w:sz="0"/>
-              <w:bottom w:val="none" w:color="FFFFFF" w:sz="0"/>
-              <w:right w:val="none" w:color="FFFFFF" w:sz="0"/>
-            </w:tcBorders>
-            <w:shd w:fill="1F2340" w:color="auto" w:val="clear"/>
-            <w:tcMar>
-              <w:top w:type="dxa" w:w="260"/>
-              <w:left w:type="dxa" w:w="320"/>
-              <w:bottom w:type="dxa" w:w="260"/>
-              <w:right w:type="dxa" w:w="320"/>
-            </w:tcMar>
-            <w:vAlign w:val="top"/>
-          </w:tcPr>
-          <w:p>
-            <w:pPr>
-              <w:spacing w:after="60" w:before="0" w:line="276"/>
-            </w:pPr>
-            <w:r>
-              <w:rPr>
-                <w:rFonts w:ascii="Georgia" w:cs="Georgia" w:eastAsia="Georgia" w:hAnsi="Georgia"/>
-                <w:color w:val="FFFFFF"/>
-                <w:sz w:val="30"/>
-                <w:szCs w:val="30"/>
-              </w:rPr>
-              <w:t xml:space="preserve">Walk this path </w:t>
-            </w:r>
-            <w:r>
-              <w:rPr>
-                <w:rFonts w:ascii="Georgia" w:cs="Georgia" w:eastAsia="Georgia" w:hAnsi="Georgia"/>
-                <w:i/>
-                <w:iCs/>
-                <w:color w:val="9DCFE0"/>
-                <w:sz w:val="30"/>
-                <w:szCs w:val="30"/>
-              </w:rPr>
-              <w:t xml:space="preserve">with us</w:t>
-            </w:r>
-          </w:p>
-          <w:p>
-            <w:pPr>
-              <w:spacing w:after="140" w:before="0" w:line="270"/>
-            </w:pPr>
-            <w:r>
-              <w:rPr>
-                <w:rFonts w:ascii="Calibri" w:cs="Calibri" w:eastAsia="Calibri" w:hAnsi="Calibri"/>
-                <w:color w:val="E3E6F0"/>
-                <w:sz w:val="18"/>
-                <w:szCs w:val="18"/>
-              </w:rPr>
-              <w:t xml:space="preserve">Companies, foundations and institutions can co-fund a project, from a single programme to a whole site. We keep partners closely informed, from the first plan to the final report.</w:t>
-            </w:r>
-          </w:p>
-          <w:p>
-            <w:pPr>
-              <w:tabs>
-                <w:tab w:val="left" w:pos="1100"/>
-              </w:tabs>
-              <w:spacing w:after="50"/>
-            </w:pPr>
-            <w:r>
-              <w:rPr>
-                <w:rFonts w:ascii="Calibri" w:cs="Calibri" w:eastAsia="Calibri" w:hAnsi="Calibri"/>
-                <w:b/>
-                <w:bCs/>
-                <w:color w:val="9DCFE0"/>
-                <w:spacing w:val="30"/>
-                <w:sz w:val="14"/>
-                <w:szCs w:val="14"/>
-              </w:rPr>
-              <w:t xml:space="preserve">VISIT</w:t>
-            </w:r>
-            <w:r>
-              <w:t xml:space="preserve">	</w:t>
-            </w:r>
-            <w:r>
-              <w:rPr>
-                <w:rFonts w:ascii="Calibri" w:cs="Calibri" w:eastAsia="Calibri" w:hAnsi="Calibri"/>
-                <w:color w:val="FFFFFF"/>
-                <w:sz w:val="18"/>
-                <w:szCs w:val="18"/>
-              </w:rPr>
-              <w:t xml:space="preserve">2nd Floor, Chandramani Apartments, Plot No. 133/134, Road No. 3, Matunga Central, Mumbai 400019</w:t>
-            </w:r>
-          </w:p>
-          <w:p>
-            <w:pPr>
-              <w:tabs>
-                <w:tab w:val="left" w:pos="1100"/>
-              </w:tabs>
-              <w:spacing w:after="50"/>
-            </w:pPr>
-            <w:r>
-              <w:rPr>
-                <w:rFonts w:ascii="Calibri" w:cs="Calibri" w:eastAsia="Calibri" w:hAnsi="Calibri"/>
-                <w:b/>
-                <w:bCs/>
-                <w:color w:val="9DCFE0"/>
-                <w:spacing w:val="30"/>
-                <w:sz w:val="14"/>
-                <w:szCs w:val="14"/>
-              </w:rPr>
-              <w:t xml:space="preserve">EMAIL</w:t>
-            </w:r>
-            <w:r>
-              <w:t xml:space="preserve">	</w:t>
-            </w:r>
-            <w:r>
-              <w:rPr>
-                <w:rFonts w:ascii="Calibri" w:cs="Calibri" w:eastAsia="Calibri" w:hAnsi="Calibri"/>
-                <w:color w:val="FFFFFF"/>
-                <w:sz w:val="18"/>
-                <w:szCs w:val="18"/>
-              </w:rPr>
-              <w:t xml:space="preserve">contact@s3impact.org.in</w:t>
-            </w:r>
-          </w:p>
-          <w:p>
-            <w:pPr>
-              <w:tabs>
-                <w:tab w:val="left" w:pos="1100"/>
-              </w:tabs>
-              <w:spacing w:after="50"/>
-            </w:pPr>
-            <w:r>
-              <w:rPr>
-                <w:rFonts w:ascii="Calibri" w:cs="Calibri" w:eastAsia="Calibri" w:hAnsi="Calibri"/>
-                <w:b/>
-                <w:bCs/>
-                <w:color w:val="9DCFE0"/>
-                <w:spacing w:val="30"/>
-                <w:sz w:val="14"/>
-                <w:szCs w:val="14"/>
-              </w:rPr>
-              <w:t xml:space="preserve">PHONE</w:t>
-            </w:r>
-            <w:r>
-              <w:t xml:space="preserve">	</w:t>
-            </w:r>
-            <w:r>
-              <w:rPr>
-                <w:rFonts w:ascii="Calibri" w:cs="Calibri" w:eastAsia="Calibri" w:hAnsi="Calibri"/>
-                <w:i/>
-                <w:iCs/>
-                <w:color w:val="13162C"/>
-                <w:sz w:val="18"/>
-                <w:szCs w:val="18"/>
-                <w:highlight w:val="yellow"/>
-              </w:rPr>
-              <w:t xml:space="preserve">Phone to be added</w:t>
-            </w:r>
-          </w:p>
-          <w:p>
-            <w:pPr>
-              <w:tabs>
-                <w:tab w:val="left" w:pos="1100"/>
-              </w:tabs>
-              <w:spacing w:after="50"/>
-            </w:pPr>
-            <w:r>
-              <w:rPr>
-                <w:rFonts w:ascii="Calibri" w:cs="Calibri" w:eastAsia="Calibri" w:hAnsi="Calibri"/>
-                <w:b/>
-                <w:bCs/>
-                <w:color w:val="9DCFE0"/>
-                <w:spacing w:val="30"/>
-                <w:sz w:val="14"/>
-                <w:szCs w:val="14"/>
-              </w:rPr>
-              <w:t xml:space="preserve">WEBSITE</w:t>
-            </w:r>
-            <w:r>
-              <w:t xml:space="preserve">	</w:t>
-            </w:r>
-            <w:r>
-              <w:rPr>
-                <w:rFonts w:ascii="Calibri" w:cs="Calibri" w:eastAsia="Calibri" w:hAnsi="Calibri"/>
-                <w:color w:val="FFFFFF"/>
-                <w:sz w:val="18"/>
-                <w:szCs w:val="18"/>
-              </w:rPr>
-              <w:t xml:space="preserve">s3impact.org.in</w:t>
-            </w:r>
-          </w:p>
-        </w:tc>
-      </w:tr>
-    </w:tbl>
+    <w:p>
+      <w:pPr>
+        <w:keepNext/>
+        <w:spacing w:after="60" w:before="260" w:line="276"/>
+      </w:pPr>
+      <w:r>
+        <w:rPr>
+          <w:rFonts w:ascii="Georgia" w:cs="Georgia" w:eastAsia="Georgia" w:hAnsi="Georgia"/>
+          <w:color w:val="13162C"/>
+          <w:sz w:val="30"/>
+          <w:szCs w:val="30"/>
+        </w:rPr>
+        <w:t xml:space="preserve">Walk this path </w:t>
+      </w:r>
+      <w:r>
+        <w:rPr>
+          <w:rFonts w:ascii="Georgia" w:cs="Georgia" w:eastAsia="Georgia" w:hAnsi="Georgia"/>
+          <w:i/>
+          <w:iCs/>
+          <w:color w:val="2F7FA0"/>
+          <w:sz w:val="30"/>
+          <w:szCs w:val="30"/>
+        </w:rPr>
+        <w:t xml:space="preserve">with us</w:t>
+      </w:r>
+    </w:p>
+    <w:p>
+      <w:pPr>
+        <w:spacing w:after="0" w:before="0" w:line="280"/>
+      </w:pPr>
+      <w:r>
+        <w:rPr>
+          <w:rFonts w:ascii="Calibri" w:cs="Calibri" w:eastAsia="Calibri" w:hAnsi="Calibri"/>
+          <w:color w:val="2E3250"/>
+          <w:sz w:val="19"/>
+          <w:szCs w:val="19"/>
+        </w:rPr>
+        <w:t xml:space="preserve">Companies, foundations and institutions can co-fund a project, from a single programme to a whole site. We keep partners closely informed, from the first plan to the final report.</w:t>
+      </w:r>
+    </w:p>
     <w:sectPr>
-      <w:footerReference w:type="default" r:id="rId6"/>
+      <w:headerReference w:type="default" r:id="rId6"/>
+      <w:footerReference w:type="default" r:id="rId7"/>
       <w:pgSz w:w="11906" w:h="16838" w:orient="portrait"/>
-      <w:pgMar w:top="900" w:right="1134" w:bottom="900" w:left="1134" w:header="708" w:footer="708" w:gutter="0"/>
+      <w:pgMar w:top="1900" w:right="1134" w:bottom="1300" w:left="1134" w:header="0" w:footer="0" w:gutter="0"/>
       <w:pgNumType/>
       <w:docGrid w:linePitch="360"/>
     </w:sectPr>
@@ -2426,21 +2120,175 @@
 
 <file path=word/footer1.xml><?xml version="1.0" encoding="utf-8"?>
 <w:ftr xmlns:wpc="http://schemas.microsoft.com/office/word/2010/wordprocessingCanvas" xmlns:mc="http://schemas.openxmlformats.org/markup-compatibility/2006" xmlns:o="urn:schemas-microsoft-com:office:office" xmlns:r="http://schemas.openxmlformats.org/officeDocument/2006/relationships" xmlns:m="http://schemas.openxmlformats.org/officeDocument/2006/math" xmlns:v="urn:schemas-microsoft-com:vml" xmlns:wp14="http://schemas.microsoft.com/office/word/2010/wordprocessingDrawing" xmlns:wp="http://schemas.openxmlformats.org/drawingml/2006/wordprocessingDrawing" xmlns:w10="urn:schemas-microsoft-com:office:word" xmlns:w="http://schemas.openxmlformats.org/wordprocessingml/2006/main" xmlns:w14="http://schemas.microsoft.com/office/word/2010/wordml" xmlns:w15="http://schemas.microsoft.com/office/word/2012/wordml" xmlns:wpg="http://schemas.microsoft.com/office/word/2010/wordprocessingGroup" xmlns:wpi="http://schemas.microsoft.com/office/word/2010/wordprocessingInk" xmlns:wne="http://schemas.microsoft.com/office/word/2006/wordml" xmlns:wps="http://schemas.microsoft.com/office/word/2010/wordprocessingShape">
-  <w:p>
-    <w:pPr>
-      <w:spacing w:after="0" w:before="0" w:line="276"/>
-      <w:jc w:val="center"/>
-    </w:pPr>
-    <w:r>
-      <w:rPr>
-        <w:rFonts w:ascii="Calibri" w:cs="Calibri" w:eastAsia="Calibri" w:hAnsi="Calibri"/>
-        <w:color w:val="5A5F7E"/>
-        <w:sz w:val="14"/>
-        <w:szCs w:val="14"/>
-      </w:rPr>
-      <w:t xml:space="preserve">S3 Impact Foundation  ·  Rooted in service</w:t>
-    </w:r>
-  </w:p>
+  <w:tbl>
+    <w:tblPr>
+      <w:tblW w:type="dxa" w:w="11906"/>
+      <w:tblInd w:type="dxa" w:w="-1134"/>
+      <w:tblBorders>
+        <w:top w:val="none" w:color="FFFFFF" w:sz="0"/>
+        <w:left w:val="none" w:color="FFFFFF" w:sz="0"/>
+        <w:bottom w:val="none" w:color="FFFFFF" w:sz="0"/>
+        <w:right w:val="none" w:color="FFFFFF" w:sz="0"/>
+        <w:insideH w:val="none" w:color="FFFFFF" w:sz="0"/>
+        <w:insideV w:val="none" w:color="FFFFFF" w:sz="0"/>
+      </w:tblBorders>
+      <w:tblLayout w:type="fixed"/>
+    </w:tblPr>
+    <w:tblGrid>
+      <w:gridCol w:w="7100"/>
+      <w:gridCol w:w="4806"/>
+    </w:tblGrid>
+    <w:tr>
+      <w:trPr>
+        <w:trHeight w:val="1000" w:hRule="exact"/>
+      </w:trPr>
+      <w:tc>
+        <w:tcPr>
+          <w:tcW w:type="dxa" w:w="7100"/>
+          <w:tcBorders>
+            <w:top w:val="none" w:color="FFFFFF" w:sz="0"/>
+            <w:left w:val="none" w:color="FFFFFF" w:sz="0"/>
+            <w:bottom w:val="none" w:color="FFFFFF" w:sz="0"/>
+            <w:right w:val="none" w:color="FFFFFF" w:sz="0"/>
+          </w:tcBorders>
+          <w:shd w:fill="1F2340" w:color="auto" w:val="clear"/>
+          <w:tcMar>
+            <w:top w:type="dxa" w:w="0"/>
+            <w:left w:type="dxa" w:w="1134"/>
+            <w:bottom w:type="dxa" w:w="0"/>
+            <w:right w:type="dxa" w:w="0"/>
+          </w:tcMar>
+          <w:vAlign w:val="center"/>
+        </w:tcPr>
+        <w:p>
+          <w:pPr>
+            <w:spacing w:after="30" w:before="0" w:line="240"/>
+          </w:pPr>
+          <w:r>
+            <w:rPr>
+              <w:rFonts w:ascii="Calibri" w:cs="Calibri" w:eastAsia="Calibri" w:hAnsi="Calibri"/>
+              <w:b/>
+              <w:bCs/>
+              <w:color w:val="9DCFE0"/>
+              <w:spacing w:val="30"/>
+              <w:sz w:val="13"/>
+              <w:szCs w:val="13"/>
+            </w:rPr>
+            <w:t xml:space="preserve">VISIT   </w:t>
+          </w:r>
+          <w:r>
+            <w:rPr>
+              <w:rFonts w:ascii="Calibri" w:cs="Calibri" w:eastAsia="Calibri" w:hAnsi="Calibri"/>
+              <w:color w:val="FFFFFF"/>
+              <w:sz w:val="16"/>
+              <w:szCs w:val="16"/>
+            </w:rPr>
+            <w:t xml:space="preserve">2nd Floor, Chandramani Apartments, Plot No. 133/134, Road No. 3, Matunga Central, Mumbai 400019</w:t>
+          </w:r>
+        </w:p>
+        <w:p>
+          <w:pPr>
+            <w:spacing w:after="30" w:before="0" w:line="240"/>
+          </w:pPr>
+          <w:r>
+            <w:rPr>
+              <w:rFonts w:ascii="Calibri" w:cs="Calibri" w:eastAsia="Calibri" w:hAnsi="Calibri"/>
+              <w:b/>
+              <w:bCs/>
+              <w:color w:val="9DCFE0"/>
+              <w:spacing w:val="30"/>
+              <w:sz w:val="13"/>
+              <w:szCs w:val="13"/>
+            </w:rPr>
+            <w:t xml:space="preserve">PHONE   </w:t>
+          </w:r>
+          <w:r>
+            <w:rPr>
+              <w:rFonts w:ascii="Calibri" w:cs="Calibri" w:eastAsia="Calibri" w:hAnsi="Calibri"/>
+              <w:i/>
+              <w:iCs/>
+              <w:color w:val="13162C"/>
+              <w:sz w:val="18"/>
+              <w:szCs w:val="18"/>
+              <w:highlight w:val="yellow"/>
+            </w:rPr>
+            <w:t xml:space="preserve">Phone to be added</w:t>
+          </w:r>
+        </w:p>
+      </w:tc>
+      <w:tc>
+        <w:tcPr>
+          <w:tcW w:type="dxa" w:w="4806"/>
+          <w:tcBorders>
+            <w:top w:val="none" w:color="FFFFFF" w:sz="0"/>
+            <w:left w:val="none" w:color="FFFFFF" w:sz="0"/>
+            <w:bottom w:val="none" w:color="FFFFFF" w:sz="0"/>
+            <w:right w:val="none" w:color="FFFFFF" w:sz="0"/>
+          </w:tcBorders>
+          <w:shd w:fill="1F2340" w:color="auto" w:val="clear"/>
+          <w:tcMar>
+            <w:top w:type="dxa" w:w="0"/>
+            <w:left w:type="dxa" w:w="0"/>
+            <w:bottom w:type="dxa" w:w="0"/>
+            <w:right w:type="dxa" w:w="1134"/>
+          </w:tcMar>
+          <w:vAlign w:val="center"/>
+        </w:tcPr>
+        <w:p>
+          <w:pPr>
+            <w:spacing w:after="30" w:before="0" w:line="240"/>
+          </w:pPr>
+          <w:r>
+            <w:rPr>
+              <w:rFonts w:ascii="Calibri" w:cs="Calibri" w:eastAsia="Calibri" w:hAnsi="Calibri"/>
+              <w:b/>
+              <w:bCs/>
+              <w:color w:val="9DCFE0"/>
+              <w:spacing w:val="30"/>
+              <w:sz w:val="13"/>
+              <w:szCs w:val="13"/>
+            </w:rPr>
+            <w:t xml:space="preserve">EMAIL   </w:t>
+          </w:r>
+          <w:r>
+            <w:rPr>
+              <w:rFonts w:ascii="Calibri" w:cs="Calibri" w:eastAsia="Calibri" w:hAnsi="Calibri"/>
+              <w:color w:val="FFFFFF"/>
+              <w:sz w:val="16"/>
+              <w:szCs w:val="16"/>
+            </w:rPr>
+            <w:t xml:space="preserve">contact@s3impact.org.in</w:t>
+          </w:r>
+        </w:p>
+        <w:p>
+          <w:pPr>
+            <w:spacing w:after="30" w:before="0" w:line="240"/>
+          </w:pPr>
+          <w:r>
+            <w:rPr>
+              <w:rFonts w:ascii="Calibri" w:cs="Calibri" w:eastAsia="Calibri" w:hAnsi="Calibri"/>
+              <w:b/>
+              <w:bCs/>
+              <w:color w:val="9DCFE0"/>
+              <w:spacing w:val="30"/>
+              <w:sz w:val="13"/>
+              <w:szCs w:val="13"/>
+            </w:rPr>
+            <w:t xml:space="preserve">WEB   </w:t>
+          </w:r>
+          <w:r>
+            <w:rPr>
+              <w:rFonts w:ascii="Calibri" w:cs="Calibri" w:eastAsia="Calibri" w:hAnsi="Calibri"/>
+              <w:color w:val="FFFFFF"/>
+              <w:sz w:val="16"/>
+              <w:szCs w:val="16"/>
+            </w:rPr>
+            <w:t xml:space="preserve">s3impact.org.in</w:t>
+          </w:r>
+        </w:p>
+      </w:tc>
+    </w:tr>
+  </w:tbl>
 </w:ftr>
 </file>
 
@@ -2479,6 +2327,151 @@
     </w:p>
   </w:footnote>
 </w:footnotes>
+</file>
+
+<file path=word/header1.xml><?xml version="1.0" encoding="utf-8"?>
+<w:hdr xmlns:wpc="http://schemas.microsoft.com/office/word/2010/wordprocessingCanvas" xmlns:mc="http://schemas.openxmlformats.org/markup-compatibility/2006" xmlns:o="urn:schemas-microsoft-com:office:office" xmlns:r="http://schemas.openxmlformats.org/officeDocument/2006/relationships" xmlns:m="http://schemas.openxmlformats.org/officeDocument/2006/math" xmlns:v="urn:schemas-microsoft-com:vml" xmlns:wp14="http://schemas.microsoft.com/office/word/2010/wordprocessingDrawing" xmlns:wp="http://schemas.openxmlformats.org/drawingml/2006/wordprocessingDrawing" xmlns:w10="urn:schemas-microsoft-com:office:word" xmlns:w="http://schemas.openxmlformats.org/wordprocessingml/2006/main" xmlns:w14="http://schemas.microsoft.com/office/word/2010/wordml" xmlns:w15="http://schemas.microsoft.com/office/word/2012/wordml" xmlns:wpg="http://schemas.microsoft.com/office/word/2010/wordprocessingGroup" xmlns:wpi="http://schemas.microsoft.com/office/word/2010/wordprocessingInk" xmlns:wne="http://schemas.microsoft.com/office/word/2006/wordml" xmlns:wps="http://schemas.microsoft.com/office/word/2010/wordprocessingShape" xmlns:cx="http://schemas.microsoft.com/office/drawing/2014/chartex" xmlns:cx1="http://schemas.microsoft.com/office/drawing/2015/9/8/chartex" xmlns:cx2="http://schemas.microsoft.com/office/drawing/2015/10/21/chartex" xmlns:cx3="http://schemas.microsoft.com/office/drawing/2016/5/9/chartex" xmlns:cx4="http://schemas.microsoft.com/office/drawing/2016/5/10/chartex" xmlns:cx5="http://schemas.microsoft.com/office/drawing/2016/5/11/chartex" xmlns:cx6="http://schemas.microsoft.com/office/drawing/2016/5/12/chartex" xmlns:cx7="http://schemas.microsoft.com/office/drawing/2016/5/13/chartex" xmlns:cx8="http://schemas.microsoft.com/office/drawing/2016/5/14/chartex" xmlns:w16cid="http://schemas.microsoft.com/office/word/2016/wordml/cid" xmlns:w16se="http://schemas.microsoft.com/office/word/2015/wordml/symex">
+  <w:tbl>
+    <w:tblPr>
+      <w:tblW w:type="dxa" w:w="11906"/>
+      <w:tblInd w:type="dxa" w:w="-1134"/>
+      <w:tblBorders>
+        <w:top w:val="none" w:color="FFFFFF" w:sz="0"/>
+        <w:left w:val="none" w:color="FFFFFF" w:sz="0"/>
+        <w:bottom w:val="none" w:color="FFFFFF" w:sz="0"/>
+        <w:right w:val="none" w:color="FFFFFF" w:sz="0"/>
+        <w:insideH w:val="none" w:color="FFFFFF" w:sz="0"/>
+        <w:insideV w:val="none" w:color="FFFFFF" w:sz="0"/>
+      </w:tblBorders>
+      <w:tblLayout w:type="fixed"/>
+    </w:tblPr>
+    <w:tblGrid>
+      <w:gridCol w:w="5953"/>
+      <w:gridCol w:w="5953"/>
+    </w:tblGrid>
+    <w:tr>
+      <w:trPr>
+        <w:trHeight w:val="1500" w:hRule="exact"/>
+      </w:trPr>
+      <w:tc>
+        <w:tcPr>
+          <w:tcW w:type="dxa" w:w="5953"/>
+          <w:tcBorders>
+            <w:top w:val="none" w:color="FFFFFF" w:sz="0"/>
+            <w:left w:val="none" w:color="FFFFFF" w:sz="0"/>
+            <w:bottom w:val="none" w:color="FFFFFF" w:sz="0"/>
+            <w:right w:val="none" w:color="FFFFFF" w:sz="0"/>
+          </w:tcBorders>
+          <w:shd w:fill="1F2340" w:color="auto" w:val="clear"/>
+          <w:tcMar>
+            <w:top w:type="dxa" w:w="0"/>
+            <w:left w:type="dxa" w:w="1134"/>
+            <w:bottom w:type="dxa" w:w="0"/>
+            <w:right w:type="dxa" w:w="0"/>
+          </w:tcMar>
+          <w:vAlign w:val="center"/>
+        </w:tcPr>
+        <w:p>
+          <w:pPr>
+            <w:spacing w:after="0" w:before="0"/>
+          </w:pPr>
+          <w:r>
+            <w:drawing>
+              <wp:inline distT="0" distB="0" distL="0" distR="0">
+                <wp:extent cx="1866900" cy="733425"/>
+                <wp:effectExtent t="0" r="0" b="0" l="0"/>
+                <wp:docPr id="1" name=""/>
+                <wp:cNvGraphicFramePr>
+                  <a:graphicFrameLocks xmlns:a="http://schemas.openxmlformats.org/drawingml/2006/main" noChangeAspect="1"/>
+                </wp:cNvGraphicFramePr>
+                <a:graphic xmlns:a="http://schemas.openxmlformats.org/drawingml/2006/main">
+                  <a:graphicData uri="http://schemas.openxmlformats.org/drawingml/2006/picture">
+                    <pic:pic xmlns:pic="http://schemas.openxmlformats.org/drawingml/2006/picture">
+                      <pic:nvPicPr>
+                        <pic:cNvPr id="0" name="" descr=""/>
+                        <pic:cNvPicPr>
+                          <a:picLocks noChangeAspect="1" noChangeArrowheads="1"/>
+                        </pic:cNvPicPr>
+                      </pic:nvPicPr>
+                      <pic:blipFill>
+                        <a:blip r:embed="rId0" cstate="none"/>
+                        <a:srcRect/>
+                        <a:stretch>
+                          <a:fillRect/>
+                        </a:stretch>
+                      </pic:blipFill>
+                      <pic:spPr bwMode="auto">
+                        <a:xfrm>
+                          <a:off x="0" y="0"/>
+                          <a:ext cx="1866900" cy="733425"/>
+                        </a:xfrm>
+                        <a:prstGeom prst="rect">
+                          <a:avLst/>
+                        </a:prstGeom>
+                      </pic:spPr>
+                    </pic:pic>
+                  </a:graphicData>
+                </a:graphic>
+              </wp:inline>
+            </w:drawing>
+          </w:r>
+        </w:p>
+      </w:tc>
+      <w:tc>
+        <w:tcPr>
+          <w:tcW w:type="dxa" w:w="5953"/>
+          <w:tcBorders>
+            <w:top w:val="none" w:color="FFFFFF" w:sz="0"/>
+            <w:left w:val="none" w:color="FFFFFF" w:sz="0"/>
+            <w:bottom w:val="none" w:color="FFFFFF" w:sz="0"/>
+            <w:right w:val="none" w:color="FFFFFF" w:sz="0"/>
+          </w:tcBorders>
+          <w:shd w:fill="1F2340" w:color="auto" w:val="clear"/>
+          <w:tcMar>
+            <w:top w:type="dxa" w:w="0"/>
+            <w:left w:type="dxa" w:w="0"/>
+            <w:bottom w:type="dxa" w:w="0"/>
+            <w:right w:type="dxa" w:w="1134"/>
+          </w:tcMar>
+          <w:vAlign w:val="center"/>
+        </w:tcPr>
+        <w:p>
+          <w:pPr>
+            <w:spacing w:after="30" w:before="0" w:line="276"/>
+            <w:jc w:val="right"/>
+          </w:pPr>
+          <w:r>
+            <w:rPr>
+              <w:rFonts w:ascii="Calibri" w:cs="Calibri" w:eastAsia="Calibri" w:hAnsi="Calibri"/>
+              <w:b/>
+              <w:bCs/>
+              <w:color w:val="9DCFE0"/>
+              <w:spacing w:val="50"/>
+              <w:sz w:val="15"/>
+              <w:szCs w:val="15"/>
+            </w:rPr>
+            <w:t xml:space="preserve">ORGANISATION PROFILE</w:t>
+          </w:r>
+        </w:p>
+        <w:p>
+          <w:pPr>
+            <w:spacing w:after="0" w:before="0" w:line="276"/>
+            <w:jc w:val="right"/>
+          </w:pPr>
+          <w:r>
+            <w:rPr>
+              <w:rFonts w:ascii="Calibri" w:cs="Calibri" w:eastAsia="Calibri" w:hAnsi="Calibri"/>
+              <w:color w:val="C9CEE0"/>
+              <w:sz w:val="16"/>
+              <w:szCs w:val="16"/>
+            </w:rPr>
+            <w:t xml:space="preserve">October 2026</w:t>
+          </w:r>
+        </w:p>
+      </w:tc>
+    </w:tr>
+  </w:tbl>
+</w:hdr>
 </file>
 
 <file path=word/numbering.xml><?xml version="1.0" encoding="utf-8"?>

</xml_diff>

<commit_message>
Word profile: header band on page 1 only, one-line footer band on page 2 only, both placed on the page so Word shows them at full colour (not yet published)
Co-Authored-By: Claude Opus 5.5 <noreply@anthropic.com>
Claude-Session: https://claude.ai/code/session_01RSCU9Tog2TmXVif83jTYoy
</commit_message>
<xml_diff>
--- a/content/S3-Impact-Foundation-Profile.docx
+++ b/content/S3-Impact-Foundation-Profile.docx
@@ -2,6 +2,147 @@
 <file path=word/document.xml><?xml version="1.0" encoding="utf-8"?>
 <w:document xmlns:wpc="http://schemas.microsoft.com/office/word/2010/wordprocessingCanvas" xmlns:mc="http://schemas.openxmlformats.org/markup-compatibility/2006" xmlns:o="urn:schemas-microsoft-com:office:office" xmlns:r="http://schemas.openxmlformats.org/officeDocument/2006/relationships" xmlns:m="http://schemas.openxmlformats.org/officeDocument/2006/math" xmlns:v="urn:schemas-microsoft-com:vml" xmlns:wp14="http://schemas.microsoft.com/office/word/2010/wordprocessingDrawing" xmlns:wp="http://schemas.openxmlformats.org/drawingml/2006/wordprocessingDrawing" xmlns:w10="urn:schemas-microsoft-com:office:word" xmlns:w="http://schemas.openxmlformats.org/wordprocessingml/2006/main" xmlns:w14="http://schemas.microsoft.com/office/word/2010/wordml" xmlns:w15="http://schemas.microsoft.com/office/word/2012/wordml" xmlns:wpg="http://schemas.microsoft.com/office/word/2010/wordprocessingGroup" xmlns:wpi="http://schemas.microsoft.com/office/word/2010/wordprocessingInk" xmlns:wne="http://schemas.microsoft.com/office/word/2006/wordml" xmlns:wps="http://schemas.microsoft.com/office/word/2010/wordprocessingShape" xmlns:cx="http://schemas.microsoft.com/office/drawing/2014/chartex" xmlns:cx1="http://schemas.microsoft.com/office/drawing/2015/9/8/chartex" xmlns:cx2="http://schemas.microsoft.com/office/drawing/2015/10/21/chartex" xmlns:cx3="http://schemas.microsoft.com/office/drawing/2016/5/9/chartex" xmlns:cx4="http://schemas.microsoft.com/office/drawing/2016/5/10/chartex" xmlns:cx5="http://schemas.microsoft.com/office/drawing/2016/5/11/chartex" xmlns:cx6="http://schemas.microsoft.com/office/drawing/2016/5/12/chartex" xmlns:cx7="http://schemas.microsoft.com/office/drawing/2016/5/13/chartex" xmlns:cx8="http://schemas.microsoft.com/office/drawing/2016/5/14/chartex" xmlns:aink="http://schemas.microsoft.com/office/drawing/2016/ink" xmlns:am3d="http://schemas.microsoft.com/office/drawing/2017/model3d" xmlns:w16cex="http://schemas.microsoft.com/office/word/2018/wordml/cex" xmlns:w16cid="http://schemas.microsoft.com/office/word/2016/wordml/cid" xmlns:w16="http://schemas.microsoft.com/office/word/2018/wordml" xmlns:w16sdtdh="http://schemas.microsoft.com/office/word/2020/wordml/sdtdatahash" xmlns:w16se="http://schemas.microsoft.com/office/word/2015/wordml/symex" mc:Ignorable="w14 w15 wp14">
   <w:body>
+    <w:tbl>
+      <w:tblPr>
+        <w:tblpPr w:tblpX="0" w:tblpY="0" w:horzAnchor="page" w:vertAnchor="page"/>
+        <w:tblOverlap w:val="never"/>
+        <w:tblW w:type="dxa" w:w="11906"/>
+        <w:tblBorders>
+          <w:top w:val="none" w:color="FFFFFF" w:sz="0"/>
+          <w:left w:val="none" w:color="FFFFFF" w:sz="0"/>
+          <w:bottom w:val="none" w:color="FFFFFF" w:sz="0"/>
+          <w:right w:val="none" w:color="FFFFFF" w:sz="0"/>
+          <w:insideH w:val="none" w:color="FFFFFF" w:sz="0"/>
+          <w:insideV w:val="none" w:color="FFFFFF" w:sz="0"/>
+        </w:tblBorders>
+        <w:tblLayout w:type="fixed"/>
+      </w:tblPr>
+      <w:tblGrid>
+        <w:gridCol w:w="5953"/>
+        <w:gridCol w:w="5953"/>
+      </w:tblGrid>
+      <w:tr>
+        <w:trPr>
+          <w:trHeight w:val="1500" w:hRule="exact"/>
+        </w:trPr>
+        <w:tc>
+          <w:tcPr>
+            <w:tcW w:type="dxa" w:w="5953"/>
+            <w:tcBorders>
+              <w:top w:val="none" w:color="FFFFFF" w:sz="0"/>
+              <w:left w:val="none" w:color="FFFFFF" w:sz="0"/>
+              <w:bottom w:val="none" w:color="FFFFFF" w:sz="0"/>
+              <w:right w:val="none" w:color="FFFFFF" w:sz="0"/>
+            </w:tcBorders>
+            <w:shd w:fill="1F2340" w:color="auto" w:val="clear"/>
+            <w:tcMar>
+              <w:top w:type="dxa" w:w="0"/>
+              <w:left w:type="dxa" w:w="1134"/>
+              <w:bottom w:type="dxa" w:w="0"/>
+              <w:right w:type="dxa" w:w="0"/>
+            </w:tcMar>
+            <w:vAlign w:val="center"/>
+          </w:tcPr>
+          <w:p>
+            <w:pPr>
+              <w:spacing w:after="0" w:before="0"/>
+            </w:pPr>
+            <w:r>
+              <w:drawing>
+                <wp:inline distT="0" distB="0" distL="0" distR="0">
+                  <wp:extent cx="1866900" cy="733425"/>
+                  <wp:effectExtent t="0" r="0" b="0" l="0"/>
+                  <wp:docPr id="1" name=""/>
+                  <wp:cNvGraphicFramePr>
+                    <a:graphicFrameLocks xmlns:a="http://schemas.openxmlformats.org/drawingml/2006/main" noChangeAspect="1"/>
+                  </wp:cNvGraphicFramePr>
+                  <a:graphic xmlns:a="http://schemas.openxmlformats.org/drawingml/2006/main">
+                    <a:graphicData uri="http://schemas.openxmlformats.org/drawingml/2006/picture">
+                      <pic:pic xmlns:pic="http://schemas.openxmlformats.org/drawingml/2006/picture">
+                        <pic:nvPicPr>
+                          <pic:cNvPr id="0" name="" descr=""/>
+                          <pic:cNvPicPr>
+                            <a:picLocks noChangeAspect="1" noChangeArrowheads="1"/>
+                          </pic:cNvPicPr>
+                        </pic:nvPicPr>
+                        <pic:blipFill>
+                          <a:blip r:embed="rId7" cstate="none"/>
+                          <a:srcRect/>
+                          <a:stretch>
+                            <a:fillRect/>
+                          </a:stretch>
+                        </pic:blipFill>
+                        <pic:spPr bwMode="auto">
+                          <a:xfrm>
+                            <a:off x="0" y="0"/>
+                            <a:ext cx="1866900" cy="733425"/>
+                          </a:xfrm>
+                          <a:prstGeom prst="rect">
+                            <a:avLst/>
+                          </a:prstGeom>
+                        </pic:spPr>
+                      </pic:pic>
+                    </a:graphicData>
+                  </a:graphic>
+                </wp:inline>
+              </w:drawing>
+            </w:r>
+          </w:p>
+        </w:tc>
+        <w:tc>
+          <w:tcPr>
+            <w:tcW w:type="dxa" w:w="5953"/>
+            <w:tcBorders>
+              <w:top w:val="none" w:color="FFFFFF" w:sz="0"/>
+              <w:left w:val="none" w:color="FFFFFF" w:sz="0"/>
+              <w:bottom w:val="none" w:color="FFFFFF" w:sz="0"/>
+              <w:right w:val="none" w:color="FFFFFF" w:sz="0"/>
+            </w:tcBorders>
+            <w:shd w:fill="1F2340" w:color="auto" w:val="clear"/>
+            <w:tcMar>
+              <w:top w:type="dxa" w:w="0"/>
+              <w:left w:type="dxa" w:w="0"/>
+              <w:bottom w:type="dxa" w:w="0"/>
+              <w:right w:type="dxa" w:w="1134"/>
+            </w:tcMar>
+            <w:vAlign w:val="center"/>
+          </w:tcPr>
+          <w:p>
+            <w:pPr>
+              <w:spacing w:after="30" w:before="0" w:line="276"/>
+              <w:jc w:val="right"/>
+            </w:pPr>
+            <w:r>
+              <w:rPr>
+                <w:rFonts w:ascii="Calibri" w:cs="Calibri" w:eastAsia="Calibri" w:hAnsi="Calibri"/>
+                <w:b/>
+                <w:bCs/>
+                <w:color w:val="9DCFE0"/>
+                <w:spacing w:val="50"/>
+                <w:sz w:val="15"/>
+                <w:szCs w:val="15"/>
+              </w:rPr>
+              <w:t xml:space="preserve">ORGANISATION PROFILE</w:t>
+            </w:r>
+          </w:p>
+          <w:p>
+            <w:pPr>
+              <w:spacing w:after="0" w:before="0" w:line="276"/>
+              <w:jc w:val="right"/>
+            </w:pPr>
+            <w:r>
+              <w:rPr>
+                <w:rFonts w:ascii="Calibri" w:cs="Calibri" w:eastAsia="Calibri" w:hAnsi="Calibri"/>
+                <w:color w:val="C9CEE0"/>
+                <w:sz w:val="16"/>
+                <w:szCs w:val="16"/>
+              </w:rPr>
+              <w:t xml:space="preserve">October 2026</w:t>
+            </w:r>
+          </w:p>
+        </w:tc>
+      </w:tr>
+    </w:tbl>
     <w:tbl>
       <w:tblPr>
         <w:tblW w:type="dxa" w:w="9638"/>
@@ -132,7 +273,7 @@
                           </pic:cNvPicPr>
                         </pic:nvPicPr>
                         <pic:blipFill>
-                          <a:blip r:embed="rId9" cstate="none"/>
+                          <a:blip r:embed="rId8" cstate="none"/>
                           <a:srcRect/>
                           <a:stretch>
                             <a:fillRect/>
@@ -875,6 +1016,12 @@
     <w:p>
       <w:pPr>
         <w:spacing w:after="50" w:before="0" w:line="276"/>
+        <w:sectPr>
+          <w:pgSz w:w="11906" w:h="16838" w:orient="portrait"/>
+          <w:pgMar w:top="1900" w:right="1134" w:bottom="900" w:left="1134" w:header="708" w:footer="708" w:gutter="0"/>
+          <w:pgNumType/>
+          <w:docGrid w:linePitch="360"/>
+        </w:sectPr>
       </w:pPr>
       <w:r>
         <w:rPr>
@@ -900,7 +1047,6 @@
     <w:p>
       <w:pPr>
         <w:keepNext/>
-        <w:pageBreakBefore/>
         <w:spacing w:after="60" w:before="0" w:line="276"/>
       </w:pPr>
       <w:r>
@@ -2069,11 +2215,143 @@
         <w:t xml:space="preserve">Companies, foundations and institutions can co-fund a project, from a single programme to a whole site. We keep partners closely informed, from the first plan to the final report.</w:t>
       </w:r>
     </w:p>
+    <w:tbl>
+      <w:tblPr>
+        <w:tblpPr w:tblpX="0" w:tblpY="16078" w:horzAnchor="page" w:vertAnchor="page"/>
+        <w:tblOverlap w:val="never"/>
+        <w:tblW w:type="dxa" w:w="11906"/>
+        <w:tblBorders>
+          <w:top w:val="none" w:color="FFFFFF" w:sz="0"/>
+          <w:left w:val="none" w:color="FFFFFF" w:sz="0"/>
+          <w:bottom w:val="none" w:color="FFFFFF" w:sz="0"/>
+          <w:right w:val="none" w:color="FFFFFF" w:sz="0"/>
+          <w:insideH w:val="none" w:color="FFFFFF" w:sz="0"/>
+          <w:insideV w:val="none" w:color="FFFFFF" w:sz="0"/>
+        </w:tblBorders>
+        <w:tblLayout w:type="fixed"/>
+      </w:tblPr>
+      <w:tblGrid>
+        <w:gridCol w:w="11906"/>
+      </w:tblGrid>
+      <w:tr>
+        <w:trPr>
+          <w:trHeight w:val="760" w:hRule="exact"/>
+        </w:trPr>
+        <w:tc>
+          <w:tcPr>
+            <w:tcW w:type="dxa" w:w="11906"/>
+            <w:tcBorders>
+              <w:top w:val="none" w:color="FFFFFF" w:sz="0"/>
+              <w:left w:val="none" w:color="FFFFFF" w:sz="0"/>
+              <w:bottom w:val="none" w:color="FFFFFF" w:sz="0"/>
+              <w:right w:val="none" w:color="FFFFFF" w:sz="0"/>
+            </w:tcBorders>
+            <w:shd w:fill="1F2340" w:color="auto" w:val="clear"/>
+            <w:tcMar>
+              <w:top w:type="dxa" w:w="0"/>
+              <w:left w:type="dxa" w:w="1134"/>
+              <w:bottom w:type="dxa" w:w="0"/>
+              <w:right w:type="dxa" w:w="1134"/>
+            </w:tcMar>
+            <w:vAlign w:val="center"/>
+          </w:tcPr>
+          <w:p>
+            <w:pPr>
+              <w:spacing w:after="0" w:before="0" w:line="240"/>
+              <w:jc w:val="center"/>
+            </w:pPr>
+            <w:r>
+              <w:rPr>
+                <w:rFonts w:ascii="Calibri" w:cs="Calibri" w:eastAsia="Calibri" w:hAnsi="Calibri"/>
+                <w:b/>
+                <w:bCs/>
+                <w:color w:val="9DCFE0"/>
+                <w:spacing w:val="30"/>
+                <w:sz w:val="14"/>
+                <w:szCs w:val="14"/>
+              </w:rPr>
+              <w:t xml:space="preserve">EMAIL   </w:t>
+            </w:r>
+            <w:r>
+              <w:rPr>
+                <w:rFonts w:ascii="Calibri" w:cs="Calibri" w:eastAsia="Calibri" w:hAnsi="Calibri"/>
+                <w:color w:val="FFFFFF"/>
+                <w:sz w:val="16"/>
+                <w:szCs w:val="16"/>
+              </w:rPr>
+              <w:t xml:space="preserve">contact@s3impact.org.in</w:t>
+            </w:r>
+            <w:r>
+              <w:rPr>
+                <w:rFonts w:ascii="Calibri" w:cs="Calibri" w:eastAsia="Calibri" w:hAnsi="Calibri"/>
+                <w:color w:val="2E3250"/>
+                <w:sz w:val="20"/>
+                <w:szCs w:val="20"/>
+              </w:rPr>
+              <w:t xml:space="preserve">        </w:t>
+            </w:r>
+            <w:r>
+              <w:rPr>
+                <w:rFonts w:ascii="Calibri" w:cs="Calibri" w:eastAsia="Calibri" w:hAnsi="Calibri"/>
+                <w:b/>
+                <w:bCs/>
+                <w:color w:val="9DCFE0"/>
+                <w:spacing w:val="30"/>
+                <w:sz w:val="14"/>
+                <w:szCs w:val="14"/>
+              </w:rPr>
+              <w:t xml:space="preserve">PHONE   </w:t>
+            </w:r>
+            <w:r>
+              <w:rPr>
+                <w:rFonts w:ascii="Calibri" w:cs="Calibri" w:eastAsia="Calibri" w:hAnsi="Calibri"/>
+                <w:i/>
+                <w:iCs/>
+                <w:color w:val="13162C"/>
+                <w:sz w:val="18"/>
+                <w:szCs w:val="18"/>
+                <w:highlight w:val="yellow"/>
+              </w:rPr>
+              <w:t xml:space="preserve">Phone to be added</w:t>
+            </w:r>
+            <w:r>
+              <w:rPr>
+                <w:rFonts w:ascii="Calibri" w:cs="Calibri" w:eastAsia="Calibri" w:hAnsi="Calibri"/>
+                <w:color w:val="2E3250"/>
+                <w:sz w:val="20"/>
+                <w:szCs w:val="20"/>
+              </w:rPr>
+              <w:t xml:space="preserve">        </w:t>
+            </w:r>
+            <w:r>
+              <w:rPr>
+                <w:rFonts w:ascii="Calibri" w:cs="Calibri" w:eastAsia="Calibri" w:hAnsi="Calibri"/>
+                <w:b/>
+                <w:bCs/>
+                <w:color w:val="9DCFE0"/>
+                <w:spacing w:val="30"/>
+                <w:sz w:val="14"/>
+                <w:szCs w:val="14"/>
+              </w:rPr>
+              <w:t xml:space="preserve">WEB   </w:t>
+            </w:r>
+            <w:r>
+              <w:rPr>
+                <w:rFonts w:ascii="Calibri" w:cs="Calibri" w:eastAsia="Calibri" w:hAnsi="Calibri"/>
+                <w:color w:val="FFFFFF"/>
+                <w:sz w:val="16"/>
+                <w:szCs w:val="16"/>
+              </w:rPr>
+              <w:t xml:space="preserve">s3impact.org.in</w:t>
+            </w:r>
+          </w:p>
+        </w:tc>
+      </w:tr>
+    </w:tbl>
     <w:sectPr>
-      <w:headerReference w:type="default" r:id="rId6"/>
-      <w:footerReference w:type="default" r:id="rId7"/>
+      <w:type w:val="nextPage"/>
       <w:pgSz w:w="11906" w:h="16838" w:orient="portrait"/>
-      <w:pgMar w:top="1900" w:right="1134" w:bottom="1300" w:left="1134" w:header="0" w:footer="0" w:gutter="0"/>
+      <w:pgMar w:top="900" w:right="1134" w:bottom="0" w:left="1134" w:header="708" w:footer="0" w:gutter="0"/>
       <w:pgNumType/>
       <w:docGrid w:linePitch="360"/>
     </w:sectPr>
@@ -2118,180 +2396,6 @@
 </w:endnotes>
 </file>
 
-<file path=word/footer1.xml><?xml version="1.0" encoding="utf-8"?>
-<w:ftr xmlns:wpc="http://schemas.microsoft.com/office/word/2010/wordprocessingCanvas" xmlns:mc="http://schemas.openxmlformats.org/markup-compatibility/2006" xmlns:o="urn:schemas-microsoft-com:office:office" xmlns:r="http://schemas.openxmlformats.org/officeDocument/2006/relationships" xmlns:m="http://schemas.openxmlformats.org/officeDocument/2006/math" xmlns:v="urn:schemas-microsoft-com:vml" xmlns:wp14="http://schemas.microsoft.com/office/word/2010/wordprocessingDrawing" xmlns:wp="http://schemas.openxmlformats.org/drawingml/2006/wordprocessingDrawing" xmlns:w10="urn:schemas-microsoft-com:office:word" xmlns:w="http://schemas.openxmlformats.org/wordprocessingml/2006/main" xmlns:w14="http://schemas.microsoft.com/office/word/2010/wordml" xmlns:w15="http://schemas.microsoft.com/office/word/2012/wordml" xmlns:wpg="http://schemas.microsoft.com/office/word/2010/wordprocessingGroup" xmlns:wpi="http://schemas.microsoft.com/office/word/2010/wordprocessingInk" xmlns:wne="http://schemas.microsoft.com/office/word/2006/wordml" xmlns:wps="http://schemas.microsoft.com/office/word/2010/wordprocessingShape">
-  <w:tbl>
-    <w:tblPr>
-      <w:tblW w:type="dxa" w:w="11906"/>
-      <w:tblInd w:type="dxa" w:w="-1134"/>
-      <w:tblBorders>
-        <w:top w:val="none" w:color="FFFFFF" w:sz="0"/>
-        <w:left w:val="none" w:color="FFFFFF" w:sz="0"/>
-        <w:bottom w:val="none" w:color="FFFFFF" w:sz="0"/>
-        <w:right w:val="none" w:color="FFFFFF" w:sz="0"/>
-        <w:insideH w:val="none" w:color="FFFFFF" w:sz="0"/>
-        <w:insideV w:val="none" w:color="FFFFFF" w:sz="0"/>
-      </w:tblBorders>
-      <w:tblLayout w:type="fixed"/>
-    </w:tblPr>
-    <w:tblGrid>
-      <w:gridCol w:w="7100"/>
-      <w:gridCol w:w="4806"/>
-    </w:tblGrid>
-    <w:tr>
-      <w:trPr>
-        <w:trHeight w:val="1000" w:hRule="exact"/>
-      </w:trPr>
-      <w:tc>
-        <w:tcPr>
-          <w:tcW w:type="dxa" w:w="7100"/>
-          <w:tcBorders>
-            <w:top w:val="none" w:color="FFFFFF" w:sz="0"/>
-            <w:left w:val="none" w:color="FFFFFF" w:sz="0"/>
-            <w:bottom w:val="none" w:color="FFFFFF" w:sz="0"/>
-            <w:right w:val="none" w:color="FFFFFF" w:sz="0"/>
-          </w:tcBorders>
-          <w:shd w:fill="1F2340" w:color="auto" w:val="clear"/>
-          <w:tcMar>
-            <w:top w:type="dxa" w:w="0"/>
-            <w:left w:type="dxa" w:w="1134"/>
-            <w:bottom w:type="dxa" w:w="0"/>
-            <w:right w:type="dxa" w:w="0"/>
-          </w:tcMar>
-          <w:vAlign w:val="center"/>
-        </w:tcPr>
-        <w:p>
-          <w:pPr>
-            <w:spacing w:after="30" w:before="0" w:line="240"/>
-          </w:pPr>
-          <w:r>
-            <w:rPr>
-              <w:rFonts w:ascii="Calibri" w:cs="Calibri" w:eastAsia="Calibri" w:hAnsi="Calibri"/>
-              <w:b/>
-              <w:bCs/>
-              <w:color w:val="9DCFE0"/>
-              <w:spacing w:val="30"/>
-              <w:sz w:val="13"/>
-              <w:szCs w:val="13"/>
-            </w:rPr>
-            <w:t xml:space="preserve">VISIT   </w:t>
-          </w:r>
-          <w:r>
-            <w:rPr>
-              <w:rFonts w:ascii="Calibri" w:cs="Calibri" w:eastAsia="Calibri" w:hAnsi="Calibri"/>
-              <w:color w:val="FFFFFF"/>
-              <w:sz w:val="16"/>
-              <w:szCs w:val="16"/>
-            </w:rPr>
-            <w:t xml:space="preserve">2nd Floor, Chandramani Apartments, Plot No. 133/134, Road No. 3, Matunga Central, Mumbai 400019</w:t>
-          </w:r>
-        </w:p>
-        <w:p>
-          <w:pPr>
-            <w:spacing w:after="30" w:before="0" w:line="240"/>
-          </w:pPr>
-          <w:r>
-            <w:rPr>
-              <w:rFonts w:ascii="Calibri" w:cs="Calibri" w:eastAsia="Calibri" w:hAnsi="Calibri"/>
-              <w:b/>
-              <w:bCs/>
-              <w:color w:val="9DCFE0"/>
-              <w:spacing w:val="30"/>
-              <w:sz w:val="13"/>
-              <w:szCs w:val="13"/>
-            </w:rPr>
-            <w:t xml:space="preserve">PHONE   </w:t>
-          </w:r>
-          <w:r>
-            <w:rPr>
-              <w:rFonts w:ascii="Calibri" w:cs="Calibri" w:eastAsia="Calibri" w:hAnsi="Calibri"/>
-              <w:i/>
-              <w:iCs/>
-              <w:color w:val="13162C"/>
-              <w:sz w:val="18"/>
-              <w:szCs w:val="18"/>
-              <w:highlight w:val="yellow"/>
-            </w:rPr>
-            <w:t xml:space="preserve">Phone to be added</w:t>
-          </w:r>
-        </w:p>
-      </w:tc>
-      <w:tc>
-        <w:tcPr>
-          <w:tcW w:type="dxa" w:w="4806"/>
-          <w:tcBorders>
-            <w:top w:val="none" w:color="FFFFFF" w:sz="0"/>
-            <w:left w:val="none" w:color="FFFFFF" w:sz="0"/>
-            <w:bottom w:val="none" w:color="FFFFFF" w:sz="0"/>
-            <w:right w:val="none" w:color="FFFFFF" w:sz="0"/>
-          </w:tcBorders>
-          <w:shd w:fill="1F2340" w:color="auto" w:val="clear"/>
-          <w:tcMar>
-            <w:top w:type="dxa" w:w="0"/>
-            <w:left w:type="dxa" w:w="0"/>
-            <w:bottom w:type="dxa" w:w="0"/>
-            <w:right w:type="dxa" w:w="1134"/>
-          </w:tcMar>
-          <w:vAlign w:val="center"/>
-        </w:tcPr>
-        <w:p>
-          <w:pPr>
-            <w:spacing w:after="30" w:before="0" w:line="240"/>
-          </w:pPr>
-          <w:r>
-            <w:rPr>
-              <w:rFonts w:ascii="Calibri" w:cs="Calibri" w:eastAsia="Calibri" w:hAnsi="Calibri"/>
-              <w:b/>
-              <w:bCs/>
-              <w:color w:val="9DCFE0"/>
-              <w:spacing w:val="30"/>
-              <w:sz w:val="13"/>
-              <w:szCs w:val="13"/>
-            </w:rPr>
-            <w:t xml:space="preserve">EMAIL   </w:t>
-          </w:r>
-          <w:r>
-            <w:rPr>
-              <w:rFonts w:ascii="Calibri" w:cs="Calibri" w:eastAsia="Calibri" w:hAnsi="Calibri"/>
-              <w:color w:val="FFFFFF"/>
-              <w:sz w:val="16"/>
-              <w:szCs w:val="16"/>
-            </w:rPr>
-            <w:t xml:space="preserve">contact@s3impact.org.in</w:t>
-          </w:r>
-        </w:p>
-        <w:p>
-          <w:pPr>
-            <w:spacing w:after="30" w:before="0" w:line="240"/>
-          </w:pPr>
-          <w:r>
-            <w:rPr>
-              <w:rFonts w:ascii="Calibri" w:cs="Calibri" w:eastAsia="Calibri" w:hAnsi="Calibri"/>
-              <w:b/>
-              <w:bCs/>
-              <w:color w:val="9DCFE0"/>
-              <w:spacing w:val="30"/>
-              <w:sz w:val="13"/>
-              <w:szCs w:val="13"/>
-            </w:rPr>
-            <w:t xml:space="preserve">WEB   </w:t>
-          </w:r>
-          <w:r>
-            <w:rPr>
-              <w:rFonts w:ascii="Calibri" w:cs="Calibri" w:eastAsia="Calibri" w:hAnsi="Calibri"/>
-              <w:color w:val="FFFFFF"/>
-              <w:sz w:val="16"/>
-              <w:szCs w:val="16"/>
-            </w:rPr>
-            <w:t xml:space="preserve">s3impact.org.in</w:t>
-          </w:r>
-        </w:p>
-      </w:tc>
-    </w:tr>
-  </w:tbl>
-</w:ftr>
-</file>
-
 <file path=word/footnotes.xml><?xml version="1.0" encoding="utf-8"?>
 <w:footnotes xmlns:wpc="http://schemas.microsoft.com/office/word/2010/wordprocessingCanvas" xmlns:mc="http://schemas.openxmlformats.org/markup-compatibility/2006" xmlns:o="urn:schemas-microsoft-com:office:office" xmlns:r="http://schemas.openxmlformats.org/officeDocument/2006/relationships" xmlns:m="http://schemas.openxmlformats.org/officeDocument/2006/math" xmlns:v="urn:schemas-microsoft-com:vml" xmlns:wp14="http://schemas.microsoft.com/office/word/2010/wordprocessingDrawing" xmlns:wp="http://schemas.openxmlformats.org/drawingml/2006/wordprocessingDrawing" xmlns:w10="urn:schemas-microsoft-com:office:word" xmlns:w="http://schemas.openxmlformats.org/wordprocessingml/2006/main" xmlns:w14="http://schemas.microsoft.com/office/word/2010/wordml" xmlns:w15="http://schemas.microsoft.com/office/word/2012/wordml" xmlns:wpg="http://schemas.microsoft.com/office/word/2010/wordprocessingGroup" xmlns:wpi="http://schemas.microsoft.com/office/word/2010/wordprocessingInk" xmlns:wne="http://schemas.microsoft.com/office/word/2006/wordml" xmlns:wps="http://schemas.microsoft.com/office/word/2010/wordprocessingShape" mc:Ignorable="w14 w15 wp14">
   <w:footnote w:type="separator" w:id="-1">
@@ -2327,151 +2431,6 @@
     </w:p>
   </w:footnote>
 </w:footnotes>
-</file>
-
-<file path=word/header1.xml><?xml version="1.0" encoding="utf-8"?>
-<w:hdr xmlns:wpc="http://schemas.microsoft.com/office/word/2010/wordprocessingCanvas" xmlns:mc="http://schemas.openxmlformats.org/markup-compatibility/2006" xmlns:o="urn:schemas-microsoft-com:office:office" xmlns:r="http://schemas.openxmlformats.org/officeDocument/2006/relationships" xmlns:m="http://schemas.openxmlformats.org/officeDocument/2006/math" xmlns:v="urn:schemas-microsoft-com:vml" xmlns:wp14="http://schemas.microsoft.com/office/word/2010/wordprocessingDrawing" xmlns:wp="http://schemas.openxmlformats.org/drawingml/2006/wordprocessingDrawing" xmlns:w10="urn:schemas-microsoft-com:office:word" xmlns:w="http://schemas.openxmlformats.org/wordprocessingml/2006/main" xmlns:w14="http://schemas.microsoft.com/office/word/2010/wordml" xmlns:w15="http://schemas.microsoft.com/office/word/2012/wordml" xmlns:wpg="http://schemas.microsoft.com/office/word/2010/wordprocessingGroup" xmlns:wpi="http://schemas.microsoft.com/office/word/2010/wordprocessingInk" xmlns:wne="http://schemas.microsoft.com/office/word/2006/wordml" xmlns:wps="http://schemas.microsoft.com/office/word/2010/wordprocessingShape" xmlns:cx="http://schemas.microsoft.com/office/drawing/2014/chartex" xmlns:cx1="http://schemas.microsoft.com/office/drawing/2015/9/8/chartex" xmlns:cx2="http://schemas.microsoft.com/office/drawing/2015/10/21/chartex" xmlns:cx3="http://schemas.microsoft.com/office/drawing/2016/5/9/chartex" xmlns:cx4="http://schemas.microsoft.com/office/drawing/2016/5/10/chartex" xmlns:cx5="http://schemas.microsoft.com/office/drawing/2016/5/11/chartex" xmlns:cx6="http://schemas.microsoft.com/office/drawing/2016/5/12/chartex" xmlns:cx7="http://schemas.microsoft.com/office/drawing/2016/5/13/chartex" xmlns:cx8="http://schemas.microsoft.com/office/drawing/2016/5/14/chartex" xmlns:w16cid="http://schemas.microsoft.com/office/word/2016/wordml/cid" xmlns:w16se="http://schemas.microsoft.com/office/word/2015/wordml/symex">
-  <w:tbl>
-    <w:tblPr>
-      <w:tblW w:type="dxa" w:w="11906"/>
-      <w:tblInd w:type="dxa" w:w="-1134"/>
-      <w:tblBorders>
-        <w:top w:val="none" w:color="FFFFFF" w:sz="0"/>
-        <w:left w:val="none" w:color="FFFFFF" w:sz="0"/>
-        <w:bottom w:val="none" w:color="FFFFFF" w:sz="0"/>
-        <w:right w:val="none" w:color="FFFFFF" w:sz="0"/>
-        <w:insideH w:val="none" w:color="FFFFFF" w:sz="0"/>
-        <w:insideV w:val="none" w:color="FFFFFF" w:sz="0"/>
-      </w:tblBorders>
-      <w:tblLayout w:type="fixed"/>
-    </w:tblPr>
-    <w:tblGrid>
-      <w:gridCol w:w="5953"/>
-      <w:gridCol w:w="5953"/>
-    </w:tblGrid>
-    <w:tr>
-      <w:trPr>
-        <w:trHeight w:val="1500" w:hRule="exact"/>
-      </w:trPr>
-      <w:tc>
-        <w:tcPr>
-          <w:tcW w:type="dxa" w:w="5953"/>
-          <w:tcBorders>
-            <w:top w:val="none" w:color="FFFFFF" w:sz="0"/>
-            <w:left w:val="none" w:color="FFFFFF" w:sz="0"/>
-            <w:bottom w:val="none" w:color="FFFFFF" w:sz="0"/>
-            <w:right w:val="none" w:color="FFFFFF" w:sz="0"/>
-          </w:tcBorders>
-          <w:shd w:fill="1F2340" w:color="auto" w:val="clear"/>
-          <w:tcMar>
-            <w:top w:type="dxa" w:w="0"/>
-            <w:left w:type="dxa" w:w="1134"/>
-            <w:bottom w:type="dxa" w:w="0"/>
-            <w:right w:type="dxa" w:w="0"/>
-          </w:tcMar>
-          <w:vAlign w:val="center"/>
-        </w:tcPr>
-        <w:p>
-          <w:pPr>
-            <w:spacing w:after="0" w:before="0"/>
-          </w:pPr>
-          <w:r>
-            <w:drawing>
-              <wp:inline distT="0" distB="0" distL="0" distR="0">
-                <wp:extent cx="1866900" cy="733425"/>
-                <wp:effectExtent t="0" r="0" b="0" l="0"/>
-                <wp:docPr id="1" name=""/>
-                <wp:cNvGraphicFramePr>
-                  <a:graphicFrameLocks xmlns:a="http://schemas.openxmlformats.org/drawingml/2006/main" noChangeAspect="1"/>
-                </wp:cNvGraphicFramePr>
-                <a:graphic xmlns:a="http://schemas.openxmlformats.org/drawingml/2006/main">
-                  <a:graphicData uri="http://schemas.openxmlformats.org/drawingml/2006/picture">
-                    <pic:pic xmlns:pic="http://schemas.openxmlformats.org/drawingml/2006/picture">
-                      <pic:nvPicPr>
-                        <pic:cNvPr id="0" name="" descr=""/>
-                        <pic:cNvPicPr>
-                          <a:picLocks noChangeAspect="1" noChangeArrowheads="1"/>
-                        </pic:cNvPicPr>
-                      </pic:nvPicPr>
-                      <pic:blipFill>
-                        <a:blip r:embed="rId0" cstate="none"/>
-                        <a:srcRect/>
-                        <a:stretch>
-                          <a:fillRect/>
-                        </a:stretch>
-                      </pic:blipFill>
-                      <pic:spPr bwMode="auto">
-                        <a:xfrm>
-                          <a:off x="0" y="0"/>
-                          <a:ext cx="1866900" cy="733425"/>
-                        </a:xfrm>
-                        <a:prstGeom prst="rect">
-                          <a:avLst/>
-                        </a:prstGeom>
-                      </pic:spPr>
-                    </pic:pic>
-                  </a:graphicData>
-                </a:graphic>
-              </wp:inline>
-            </w:drawing>
-          </w:r>
-        </w:p>
-      </w:tc>
-      <w:tc>
-        <w:tcPr>
-          <w:tcW w:type="dxa" w:w="5953"/>
-          <w:tcBorders>
-            <w:top w:val="none" w:color="FFFFFF" w:sz="0"/>
-            <w:left w:val="none" w:color="FFFFFF" w:sz="0"/>
-            <w:bottom w:val="none" w:color="FFFFFF" w:sz="0"/>
-            <w:right w:val="none" w:color="FFFFFF" w:sz="0"/>
-          </w:tcBorders>
-          <w:shd w:fill="1F2340" w:color="auto" w:val="clear"/>
-          <w:tcMar>
-            <w:top w:type="dxa" w:w="0"/>
-            <w:left w:type="dxa" w:w="0"/>
-            <w:bottom w:type="dxa" w:w="0"/>
-            <w:right w:type="dxa" w:w="1134"/>
-          </w:tcMar>
-          <w:vAlign w:val="center"/>
-        </w:tcPr>
-        <w:p>
-          <w:pPr>
-            <w:spacing w:after="30" w:before="0" w:line="276"/>
-            <w:jc w:val="right"/>
-          </w:pPr>
-          <w:r>
-            <w:rPr>
-              <w:rFonts w:ascii="Calibri" w:cs="Calibri" w:eastAsia="Calibri" w:hAnsi="Calibri"/>
-              <w:b/>
-              <w:bCs/>
-              <w:color w:val="9DCFE0"/>
-              <w:spacing w:val="50"/>
-              <w:sz w:val="15"/>
-              <w:szCs w:val="15"/>
-            </w:rPr>
-            <w:t xml:space="preserve">ORGANISATION PROFILE</w:t>
-          </w:r>
-        </w:p>
-        <w:p>
-          <w:pPr>
-            <w:spacing w:after="0" w:before="0" w:line="276"/>
-            <w:jc w:val="right"/>
-          </w:pPr>
-          <w:r>
-            <w:rPr>
-              <w:rFonts w:ascii="Calibri" w:cs="Calibri" w:eastAsia="Calibri" w:hAnsi="Calibri"/>
-              <w:color w:val="C9CEE0"/>
-              <w:sz w:val="16"/>
-              <w:szCs w:val="16"/>
-            </w:rPr>
-            <w:t xml:space="preserve">October 2026</w:t>
-          </w:r>
-        </w:p>
-      </w:tc>
-    </w:tr>
-  </w:tbl>
-</w:hdr>
 </file>
 
 <file path=word/numbering.xml><?xml version="1.0" encoding="utf-8"?>

</xml_diff>